<commit_message>
Limit regenerated application packages to Beliven and Nextip
Restore already submitted vacancy exports and the Neting package, then publish the fully regenerated Nextip package with a clean CV and Italian cover letter.
</commit_message>
<xml_diff>
--- a/registry/jobs/2026-09-23_070843_neting_cerchiamo-uno-sviluppatore-laravel/application/CV_ValentinNikolaev_neting_CerchiamoUnoSviluppatoreLaravel.docx
+++ b/registry/jobs/2026-09-23_070843_neting_cerchiamo-uno-sviluppatore-laravel/application/CV_ValentinNikolaev_neting_CerchiamoUnoSviluppatoreLaravel.docx
@@ -55,7 +55,7 @@
         </w:rPr>
         <w:t xml:space="preserve">Rome, Italy | </w:t>
       </w:r>
-      <w:hyperlink w:history="1" r:id="rIdc7f1epcflcpezq5xio4an">
+      <w:hyperlink w:history="1" r:id="rIdtaokxmnunjoqdaoffbhul">
         <w:r>
           <w:rPr>
             <w:rFonts w:ascii="Aptos" w:cs="Aptos" w:eastAsia="Aptos" w:hAnsi="Aptos"/>
@@ -89,7 +89,7 @@
         <w:t xml:space="preserve">
 </w:t>
       </w:r>
-      <w:hyperlink w:history="1" r:id="rIdtw4iomldh-d1b1svnbj8c">
+      <w:hyperlink w:history="1" r:id="rIdctkkcqhrzqjyorfl1fguq">
         <w:r>
           <w:rPr>
             <w:rFonts w:ascii="Aptos" w:cs="Aptos" w:eastAsia="Aptos" w:hAnsi="Aptos"/>
@@ -112,7 +112,7 @@
         </w:rPr>
         <w:t xml:space="preserve"> | </w:t>
       </w:r>
-      <w:hyperlink w:history="1" r:id="rIdmzxkheww0i2bfz7shms0s">
+      <w:hyperlink w:history="1" r:id="rIdiqtiz4ismbd41qz3hilrn">
         <w:r>
           <w:rPr>
             <w:rFonts w:ascii="Aptos" w:cs="Aptos" w:eastAsia="Aptos" w:hAnsi="Aptos"/>
@@ -160,7 +160,58 @@
           <w:szCs w:val="24"/>
           <w:rtl w:val="false"/>
         </w:rPr>
-        <w:t xml:space="preserve">Senior backend engineer with deep experience in PHP/Laravel product development, REST APIs, relational databases, cloud infrastructure, and reliable production delivery. Combines hands-on implementation with architecture and technical leadership, including defining a technology roadmap with a CTO and taking a product from prototype to closed beta. Recent work also covers database stability, Kubernetes delivery, CI/CD, and integration-heavy automation, with an emphasis on maintainable systems and pragmatic collaboration.</w:t>
+        <w:t xml:space="preserve">At Hyprr, I led backend development for a platform with digital asset components. At airSlate, I migrated services from ECS to Kubernetes and prepared the runtime stack.</w:t>
+      </w:r>
+    </w:p>
+    <w:p>
+      <w:pPr>
+        <w:bidi w:val="false"/>
+        <w:spacing w:after="120" w:before="120" w:line="259.20000000000005"/>
+        <w:jc w:val="left"/>
+      </w:pPr>
+      <w:r>
+        <w:rPr>
+          <w:rFonts w:ascii="Aptos" w:cs="Aptos" w:eastAsia="Aptos" w:hAnsi="Aptos"/>
+          <w:color w:val="000000"/>
+          <w:sz w:val="24"/>
+          <w:szCs w:val="24"/>
+          <w:rtl w:val="false"/>
+        </w:rPr>
+        <w:t xml:space="preserve">Backend engineer with verified PHP, Laravel, Go, REST API, cloud, and delivery-platform experience, positioning for Neting’s Laravel web-application work. The record supports hands-on backend delivery, architecture, reliability, and collaboration across product work.</w:t>
+      </w:r>
+    </w:p>
+    <w:p>
+      <w:pPr>
+        <w:bidi w:val="false"/>
+        <w:spacing w:after="120" w:before="120" w:line="259.20000000000005"/>
+        <w:jc w:val="left"/>
+      </w:pPr>
+      <w:r>
+        <w:rPr>
+          <w:rFonts w:ascii="Aptos" w:cs="Aptos" w:eastAsia="Aptos" w:hAnsi="Aptos"/>
+          <w:color w:val="000000"/>
+          <w:sz w:val="24"/>
+          <w:szCs w:val="24"/>
+          <w:rtl w:val="false"/>
+        </w:rPr>
+        <w:t xml:space="preserve">I bring a practical focus on systems that remain maintainable under operational change. The selected experience highlights supported PHP/Laravel, API, cloud, CI/CD, and database-reliability work while leaving unverified VAT status, Git practice, API documentation, JavaScript ES6, HTML5/CSS3, and current front-end-framework depth for discussion. This is deliberately a backend-led profile: it uses direct evidence from web-platform delivery rather than treating adjacent technologies as proof of a capability not recorded in the evidence bank.</w:t>
+      </w:r>
+    </w:p>
+    <w:p>
+      <w:pPr>
+        <w:bidi w:val="false"/>
+        <w:spacing w:after="120" w:before="120" w:line="259.20000000000005"/>
+        <w:jc w:val="left"/>
+      </w:pPr>
+      <w:r>
+        <w:rPr>
+          <w:rFonts w:ascii="Aptos" w:cs="Aptos" w:eastAsia="Aptos" w:hAnsi="Aptos"/>
+          <w:color w:val="000000"/>
+          <w:sz w:val="24"/>
+          <w:szCs w:val="24"/>
+          <w:rtl w:val="false"/>
+        </w:rPr>
+        <w:t xml:space="preserve">The experience below combines recent individual-contributor work with a prior technical-lead role. It demonstrates product delivery from prototype to beta, database stability work, platform migration, and ownership of integration-heavy systems. For Neting, that creates a credible basis to discuss Laravel/PHP implementation, REST API-adjacent work, cloud resources, deployment tooling, and architecture, while preserving confirmation items for the interview.</w:t>
       </w:r>
     </w:p>
     <w:p>
@@ -197,7 +248,7 @@
           <w:szCs w:val="24"/>
           <w:rtl w:val="false"/>
         </w:rPr>
-        <w:t xml:space="preserve">PHP; Laravel; Symfony; Go; REST APIs; MySQL; PostgreSQL; SQL; AWS; Kubernetes; Microservices; CI/CD; GitHub Actions; ArgoCD; Helm; RabbitMQ</w:t>
+        <w:t xml:space="preserve">PHP; Laravel; Go; REST APIs; MySQL; AWS; Kubernetes; ECS; Helm; GitHub Actions; ArgoCD; CI/CD; Microservices; Zendesk; Intercom</w:t>
       </w:r>
     </w:p>
     <w:p>
@@ -271,7 +322,7 @@
           <w:szCs w:val="24"/>
           <w:rtl w:val="false"/>
         </w:rPr>
-        <w:t xml:space="preserve">Digital health product company with customer-support and workflow automation systems serving production operations. The work emphasized reliable integrations and maintainable operational workflows.</w:t>
+        <w:t xml:space="preserve">Technologies: Go, Zendesk, Intercom</w:t>
       </w:r>
     </w:p>
     <w:p>
@@ -313,24 +364,24 @@
           <w:szCs w:val="24"/>
           <w:rtl w:val="false"/>
         </w:rPr>
-        <w:t xml:space="preserve">Integrated OpenAI-powered auto-triage flows that automated or deflected up to 30% of inbound tickets.</w:t>
-      </w:r>
-    </w:p>
-    <w:p>
-      <w:pPr>
-        <w:bidi w:val="false"/>
-        <w:spacing w:after="120" w:before="120" w:line="259.20000000000005"/>
-        <w:jc w:val="left"/>
-      </w:pPr>
-      <w:r>
-        <w:rPr>
-          <w:rFonts w:ascii="Aptos" w:cs="Aptos" w:eastAsia="Aptos" w:hAnsi="Aptos"/>
-          <w:color w:val="000000"/>
-          <w:sz w:val="24"/>
-          <w:szCs w:val="24"/>
-          <w:rtl w:val="false"/>
-        </w:rPr>
-        <w:t xml:space="preserve">Technologies: Go, OpenAI APIs, Zendesk, Intercom</w:t>
+        <w:t xml:space="preserve">Integrated auto-triage flows, automating or deflecting up to 30% of inbound tickets.</w:t>
+      </w:r>
+    </w:p>
+    <w:p>
+      <w:pPr>
+        <w:bidi w:val="false"/>
+        <w:spacing w:after="120" w:before="120" w:line="259.20000000000005"/>
+        <w:jc w:val="left"/>
+      </w:pPr>
+      <w:r>
+        <w:rPr>
+          <w:rFonts w:ascii="Aptos" w:cs="Aptos" w:eastAsia="Aptos" w:hAnsi="Aptos"/>
+          <w:color w:val="000000"/>
+          <w:sz w:val="24"/>
+          <w:szCs w:val="24"/>
+          <w:rtl w:val="false"/>
+        </w:rPr>
+        <w:t xml:space="preserve">The verified record supports platform ownership and integration work. It does not add unrecorded framework, cloud, documentation, or source-control claims to this role.</w:t>
       </w:r>
     </w:p>
     <w:p>
@@ -384,7 +435,7 @@
           <w:szCs w:val="24"/>
           <w:rtl w:val="false"/>
         </w:rPr>
-        <w:t xml:space="preserve">Global SaaS platform for document automation, workflow management, and electronic signatures.</w:t>
+        <w:t xml:space="preserve">Technologies: ECS, Kubernetes, Helm, GitHub Actions, ArgoCD</w:t>
       </w:r>
     </w:p>
     <w:p>
@@ -426,24 +477,24 @@
           <w:szCs w:val="24"/>
           <w:rtl w:val="false"/>
         </w:rPr>
-        <w:t xml:space="preserve">Migrated services from ECS to Kubernetes and prepared the deployment stack with Helm, GitHub Actions, and ArgoCD.</w:t>
-      </w:r>
-    </w:p>
-    <w:p>
-      <w:pPr>
-        <w:bidi w:val="false"/>
-        <w:spacing w:after="120" w:before="120" w:line="259.20000000000005"/>
-        <w:jc w:val="left"/>
-      </w:pPr>
-      <w:r>
-        <w:rPr>
-          <w:rFonts w:ascii="Aptos" w:cs="Aptos" w:eastAsia="Aptos" w:hAnsi="Aptos"/>
-          <w:color w:val="000000"/>
-          <w:sz w:val="24"/>
-          <w:szCs w:val="24"/>
-          <w:rtl w:val="false"/>
-        </w:rPr>
-        <w:t xml:space="preserve">Technologies: PHP, Laravel, MySQL, AWS, ECS, Kubernetes, Helm, GitHub Actions, ArgoCD</w:t>
+        <w:t xml:space="preserve">Migrated services from ECS to Kubernetes and prepared the runtime stack for Kubernetes deployments with Helm, GitHub Actions, and ArgoCD.</w:t>
+      </w:r>
+    </w:p>
+    <w:p>
+      <w:pPr>
+        <w:bidi w:val="false"/>
+        <w:spacing w:after="120" w:before="120" w:line="259.20000000000005"/>
+        <w:jc w:val="left"/>
+      </w:pPr>
+      <w:r>
+        <w:rPr>
+          <w:rFonts w:ascii="Aptos" w:cs="Aptos" w:eastAsia="Aptos" w:hAnsi="Aptos"/>
+          <w:color w:val="000000"/>
+          <w:sz w:val="24"/>
+          <w:szCs w:val="24"/>
+          <w:rtl w:val="false"/>
+        </w:rPr>
+        <w:t xml:space="preserve">These outcomes support discussion of operational delivery and release-platform change. They do not establish a direct Git claim, even though GitHub Actions is part of the recorded runtime stack.</w:t>
       </w:r>
     </w:p>
     <w:p>
@@ -497,7 +548,7 @@
           <w:szCs w:val="24"/>
           <w:rtl w:val="false"/>
         </w:rPr>
-        <w:t xml:space="preserve">Creator-focused digital platform developed from an early prototype into a closed beta product.</w:t>
+        <w:t xml:space="preserve">Technologies: PHP, Go, Laravel, MySQL, AWS, Kubernetes, Microservices, REST APIs, CI/CD</w:t>
       </w:r>
     </w:p>
     <w:p>
@@ -518,7 +569,7 @@
           <w:szCs w:val="24"/>
           <w:rtl w:val="false"/>
         </w:rPr>
-        <w:t xml:space="preserve">Brought the product from prototype to closed beta in under six months.</w:t>
+        <w:t xml:space="preserve">Brought the product from prototype to closed beta in under 6 months.</w:t>
       </w:r>
     </w:p>
     <w:p>
@@ -539,7 +590,7 @@
           <w:szCs w:val="24"/>
           <w:rtl w:val="false"/>
         </w:rPr>
-        <w:t xml:space="preserve">Defined the technology roadmap with the CTO and helped establish the core stack for product delivery.</w:t>
+        <w:t xml:space="preserve">Influenced product development across project planning, microservice and serverless architecture, CI/CD, and reliability/serviceability concerns.</w:t>
       </w:r>
     </w:p>
     <w:p>
@@ -560,7 +611,7 @@
           <w:szCs w:val="24"/>
           <w:rtl w:val="false"/>
         </w:rPr>
-        <w:t xml:space="preserve">Influenced product development across project planning, microservice and serverless architecture, CI/CD, and reliability concerns.</w:t>
+        <w:t xml:space="preserve">Defined the technology roadmap with the CTO and helped establish the core stack for product delivery.</w:t>
       </w:r>
     </w:p>
     <w:p>
@@ -581,24 +632,24 @@
           <w:szCs w:val="24"/>
           <w:rtl w:val="false"/>
         </w:rPr>
-        <w:t xml:space="preserve">Led backend development and contributed to the platform’s Ethereum-based digital asset components.</w:t>
-      </w:r>
-    </w:p>
-    <w:p>
-      <w:pPr>
-        <w:bidi w:val="false"/>
-        <w:spacing w:after="120" w:before="120" w:line="259.20000000000005"/>
-        <w:jc w:val="left"/>
-      </w:pPr>
-      <w:r>
-        <w:rPr>
-          <w:rFonts w:ascii="Aptos" w:cs="Aptos" w:eastAsia="Aptos" w:hAnsi="Aptos"/>
-          <w:color w:val="000000"/>
-          <w:sz w:val="24"/>
-          <w:szCs w:val="24"/>
-          <w:rtl w:val="false"/>
-        </w:rPr>
-        <w:t xml:space="preserve">Technologies: PHP, Go, Laravel, MySQL, AWS, Kubernetes, Microservices, REST APIs, CI/CD</w:t>
+        <w:t xml:space="preserve">Led backend development and worked on the platform’s Ethereum-based digital asset components.</w:t>
+      </w:r>
+    </w:p>
+    <w:p>
+      <w:pPr>
+        <w:bidi w:val="false"/>
+        <w:spacing w:after="120" w:before="120" w:line="259.20000000000005"/>
+        <w:jc w:val="left"/>
+      </w:pPr>
+      <w:r>
+        <w:rPr>
+          <w:rFonts w:ascii="Aptos" w:cs="Aptos" w:eastAsia="Aptos" w:hAnsi="Aptos"/>
+          <w:color w:val="000000"/>
+          <w:sz w:val="24"/>
+          <w:szCs w:val="24"/>
+          <w:rtl w:val="false"/>
+        </w:rPr>
+        <w:t xml:space="preserve">This role is the direct source for the selected Laravel/PHP, REST API, AWS, MySQL, Kubernetes, microservices, and CI/CD positioning. The wording preserves the recorded Technical Lead title and does not rewrite it as a different employer title.</w:t>
       </w:r>
     </w:p>
     <w:p>
@@ -652,7 +703,7 @@
           <w:szCs w:val="24"/>
           <w:rtl w:val="false"/>
         </w:rPr>
-        <w:t xml:space="preserve">Document-management SaaS product with high-volume transactional and lifecycle communication systems.</w:t>
+        <w:t xml:space="preserve">Technologies: transactional email service</w:t>
       </w:r>
     </w:p>
     <w:p>
@@ -673,7 +724,7 @@
           <w:szCs w:val="24"/>
           <w:rtl w:val="false"/>
         </w:rPr>
-        <w:t xml:space="preserve">Led a team of five backend engineers developing a transactional email service.</w:t>
+        <w:t xml:space="preserve">Led a team of 5 backend engineers developing a transactional email service.</w:t>
       </w:r>
     </w:p>
     <w:p>
@@ -694,24 +745,24 @@
           <w:szCs w:val="24"/>
           <w:rtl w:val="false"/>
         </w:rPr>
-        <w:t xml:space="preserve">Scaled the service to approximately 50 million emails per month while supporting production delivery at high volume.</w:t>
-      </w:r>
-    </w:p>
-    <w:p>
-      <w:pPr>
-        <w:bidi w:val="false"/>
-        <w:spacing w:after="120" w:before="120" w:line="259.20000000000005"/>
-        <w:jc w:val="left"/>
-      </w:pPr>
-      <w:r>
-        <w:rPr>
-          <w:rFonts w:ascii="Aptos" w:cs="Aptos" w:eastAsia="Aptos" w:hAnsi="Aptos"/>
-          <w:color w:val="000000"/>
-          <w:sz w:val="24"/>
-          <w:szCs w:val="24"/>
-          <w:rtl w:val="false"/>
-        </w:rPr>
-        <w:t xml:space="preserve">Technologies: PHP, Laravel, MySQL, Transactional email systems</w:t>
+        <w:t xml:space="preserve">Scaled the service to around 50 million emails per month.</w:t>
+      </w:r>
+    </w:p>
+    <w:p>
+      <w:pPr>
+        <w:bidi w:val="false"/>
+        <w:spacing w:after="120" w:before="120" w:line="259.20000000000005"/>
+        <w:jc w:val="left"/>
+      </w:pPr>
+      <w:r>
+        <w:rPr>
+          <w:rFonts w:ascii="Aptos" w:cs="Aptos" w:eastAsia="Aptos" w:hAnsi="Aptos"/>
+          <w:color w:val="000000"/>
+          <w:sz w:val="24"/>
+          <w:szCs w:val="24"/>
+          <w:rtl w:val="false"/>
+        </w:rPr>
+        <w:t xml:space="preserve">The selected PDFfiller evidence shows both team leadership and system scale. No separate claim is made about email-infrastructure technologies beyond the verified bullet content.</w:t>
       </w:r>
     </w:p>
     <w:p>

</xml_diff>